<commit_message>
Add 6 new pension policy entries (Apr 22-29) with authoritative sources
New entries: China rural pension increase (¥163/m), Germany €4B subsidy cut,
Canada CPP rate cut (9.9%→9.5%), Japan "¥1.06M wall" abolition,
OECD Italy pension cost recommendations, India All India Services NPS Rules 2026

Co-Authored-By: Claude Opus 4.6 <noreply@anthropic.com>
</commit_message>
<xml_diff>
--- a/data/reports/国际养老金动态（20260401-20260504）.docx
+++ b/data/reports/国际养老金动态（20260401-20260504）.docx
@@ -41,89 +41,101 @@
           <w:rFonts w:ascii="Times New Roman" w:hAnsi="Times New Roman" w:eastAsia="宋体"/>
           <w:sz w:val="21"/>
         </w:rPr>
-        <w:t>一、养老金政策改革（共 10 条）</w:t>
+        <w:t>一、养老金政策改革（共 13 条）</w:t>
         <w:br/>
         <w:t xml:space="preserve">    【1】印度 | 第八届薪资委员会：NPS员工联合会要求恢复旧养老金制度（OPS）★</w:t>
         <w:br/>
         <w:t xml:space="preserve">    【2】英国 | 《养老金计划法案2026》获皇室批准：推动整合与投资改革★</w:t>
         <w:br/>
-        <w:t xml:space="preserve">    【3】德国 | 默茨提出法定养老金将降为"基础保障"：德国养老制度面临根本性改革★</w:t>
+        <w:t xml:space="preserve">    【3】德国 | 内阁批准2027预算框架：削减40亿欧元联邦养老金补贴★</w:t>
         <w:br/>
-        <w:t xml:space="preserve">    【4】墨西哥 | 辛鲍姆宣布进一步限制高额"金色养老金"，推进公共养老金公平化★</w:t>
+        <w:t xml:space="preserve">    【4】德国 | 默茨提出法定养老金将降为"基础保障"：德国养老制度面临根本性改革★</w:t>
         <w:br/>
-        <w:t xml:space="preserve">    【5】意大利 | 2026年意大利退休年龄因预期寿命调整再次上调</w:t>
+        <w:t xml:space="preserve">    【5】墨西哥 | 辛鲍姆宣布进一步限制高额"金色养老金"，推进公共养老金公平化★</w:t>
         <w:br/>
-        <w:t xml:space="preserve">    【6】墨西哥 | 宪法第127条改革：高额公共养老金上限调至总统薪资50%★</w:t>
+        <w:t xml:space="preserve">    【6】意大利 | OECD经济调查敦促意大利削减第一支柱养老金成本</w:t>
         <w:br/>
-        <w:t xml:space="preserve">    【7】意大利 | Quota 103提前退休选项2026年未获延期★</w:t>
+        <w:t xml:space="preserve">    【7】意大利 | 2026年意大利退休年龄因预期寿命调整再次上调</w:t>
         <w:br/>
-        <w:t xml:space="preserve">    【8】荷兰 | 参议院否决加快AOW国家养老金年龄上调提案★</w:t>
+        <w:t xml:space="preserve">    【8】墨西哥 | 宪法第127条改革：高额公共养老金上限调至总统薪资50%★</w:t>
         <w:br/>
-        <w:t xml:space="preserve">    【9】法国 | 2023年养老金改革暂停：退休年龄不再向64岁推进★</w:t>
+        <w:t xml:space="preserve">    【9】意大利 | Quota 103提前退休选项2026年未获延期★</w:t>
         <w:br/>
-        <w:t xml:space="preserve">    【10】英国 | 国家养老金年龄开始从66岁逐步升至67岁★</w:t>
+        <w:t xml:space="preserve">    【10】荷兰 | 参议院否决加快AOW国家养老金年龄上调提案★</w:t>
         <w:br/>
-        <w:t>二、养老金政策调整（共 14 条）</w:t>
+        <w:t xml:space="preserve">    【11】法国 | 2023年养老金改革暂停：退休年龄不再向64岁推进★</w:t>
         <w:br/>
-        <w:t xml:space="preserve">    【11】阿根廷 | ANSES 5月养老金上调3.38%，最低养老金增至393,174比索★</w:t>
+        <w:t xml:space="preserve">    【12】英国 | 国家养老金年龄开始从66岁逐步升至67岁★</w:t>
         <w:br/>
-        <w:t xml:space="preserve">    【12】意大利 | INPS 5月养老金自动重估值1.4%，Q1新增21.15万笔养老金</w:t>
+        <w:t xml:space="preserve">    【13】日本 | 撤销"年收入106万日元门槛"：短时间劳动者厚生年金大幅扩面★</w:t>
         <w:br/>
-        <w:t xml:space="preserve">    【13】澳大利亚 | 超级年金2026-27财年缴费上限指数化调整：税前缴费上限提高至32,500澳元</w:t>
+        <w:t>二、养老金政策调整（共 16 条）</w:t>
         <w:br/>
-        <w:t xml:space="preserve">    【14】德国 | 法定健康保险附加费率2026年升至2.9%，部分抵消养老金涨幅</w:t>
+        <w:t xml:space="preserve">    【14】阿根廷 | ANSES 5月养老金上调3.38%，最低养老金增至393,174比索★</w:t>
         <w:br/>
-        <w:t xml:space="preserve">    【15】韩国 | 韩国将加密资产纳入基础养老金资格审查范围★</w:t>
+        <w:t xml:space="preserve">    【15】意大利 | INPS 5月养老金自动重估值1.4%，Q1新增21.15万笔养老金</w:t>
         <w:br/>
-        <w:t xml:space="preserve">    【16】中国 | 五部门联合印发领取个人养老金有关问题通知★</w:t>
+        <w:t xml:space="preserve">    【16】澳大利亚 | 超级年金2026-27财年缴费上限指数化调整：税前缴费上限提高至32,500澳元</w:t>
         <w:br/>
-        <w:t xml:space="preserve">    【17】澳大利亚 | 超级年金保证费率维持12%，"按周付超级"改革7月生效★</w:t>
+        <w:t xml:space="preserve">    【17】加拿大 | 春季经济更新：CPP基础缴费率从9.9%降至9.5%，2027年生效★</w:t>
         <w:br/>
-        <w:t xml:space="preserve">    【18】德国 | 法定养老金2026年7月1日起上调4.24%★</w:t>
+        <w:t xml:space="preserve">    【18】德国 | 法定健康保险附加费率2026年升至2.9%，部分抵消养老金涨幅</w:t>
         <w:br/>
-        <w:t xml:space="preserve">    【19】英国 | 国家养老金三重锁定2026年4月生效：上涨4.8%★</w:t>
+        <w:t xml:space="preserve">    【19】韩国 | 韩国将加密资产纳入基础养老金资格审查范围★</w:t>
         <w:br/>
-        <w:t xml:space="preserve">    【20】中国 | 2026年养老金实现"22连涨"，"提低控高"差异化调整★</w:t>
+        <w:t xml:space="preserve">    【20】中国 | 五部门联合印发领取个人养老金有关问题通知★</w:t>
         <w:br/>
-        <w:t xml:space="preserve">    【21】法国 | 2026年社会保障预算法案确定最低养老金标准调整</w:t>
+        <w:t xml:space="preserve">    【21】澳大利亚 | 超级年金保证费率维持12%，"按周付超级"改革7月生效★</w:t>
         <w:br/>
-        <w:t xml:space="preserve">    【22】日本 | 国民年金4年连涨：2026年度基础年金增至70,608日元/月</w:t>
+        <w:t xml:space="preserve">    【22】德国 | 法定养老金2026年7月1日起上调4.24%★</w:t>
         <w:br/>
-        <w:t xml:space="preserve">    【23】阿根廷 | ANSES 4月养老金按2.90%上调并发放70,000比索额外补贴★</w:t>
+        <w:t xml:space="preserve">    【23】英国 | 国家养老金三重锁定2026年4月生效：上涨4.8%★</w:t>
         <w:br/>
-        <w:t xml:space="preserve">    【24】俄罗斯 | 政府签署法令：社会养老金自4月1日起上调14.75%★</w:t>
+        <w:t xml:space="preserve">    【24】中国 | 2026年养老金实现"22连涨"，"提低控高"差异化调整★</w:t>
+        <w:br/>
+        <w:t xml:space="preserve">    【25】法国 | 2026年社会保障预算法案确定最低养老金标准调整</w:t>
+        <w:br/>
+        <w:t xml:space="preserve">    【26】日本 | 国民年金4年连涨：2026年度基础年金增至70,608日元/月</w:t>
+        <w:br/>
+        <w:t xml:space="preserve">    【27】阿根廷 | ANSES 4月养老金按2.90%上调并发放70,000比索额外补贴★</w:t>
+        <w:br/>
+        <w:t xml:space="preserve">    【28】俄罗斯 | 政府签署法令：社会养老金自4月1日起上调14.75%★</w:t>
+        <w:br/>
+        <w:t xml:space="preserve">    【29】中国 | 城乡居民基础养老金月最低标准提高至163元，4月起补发差额★</w:t>
         <w:br/>
         <w:t>三、养老金基金投资（共 2 条）</w:t>
         <w:br/>
-        <w:t xml:space="preserve">    【25】日本 | GPIF管理资产达约293万亿日元，首次投资海外亚洲房地产★</w:t>
+        <w:t xml:space="preserve">    【30】日本 | GPIF管理资产达约293万亿日元，首次投资海外亚洲房地产★</w:t>
         <w:br/>
-        <w:t xml:space="preserve">    【26】韩国 | NPS外汇对冲比例拟提高，首次计划发行外币债券★</w:t>
+        <w:t xml:space="preserve">    【31】韩国 | NPS外汇对冲比例拟提高，首次计划发行外币债券★</w:t>
         <w:br/>
         <w:t>四、数据发布与统计（共 5 条）</w:t>
         <w:br/>
-        <w:t xml:space="preserve">    【27】韩国 | NPS近12万人月领超200万韩元养老金，较2018年激增</w:t>
+        <w:t xml:space="preserve">    【32】韩国 | NPS近12万人月领超200万韩元养老金，较2018年激增</w:t>
         <w:br/>
-        <w:t xml:space="preserve">    【28】中国 | 人社部一季度发布会：基本养老保险参保10.73亿人，基金累计结余10.8万亿★</w:t>
+        <w:t xml:space="preserve">    【33】中国 | 人社部一季度发布会：基本养老保险参保10.73亿人，基金累计结余10.8万亿★</w:t>
         <w:br/>
-        <w:t xml:space="preserve">    【29】美国 | 社会保障购买力报告发布：2010年以来已下降20%</w:t>
+        <w:t xml:space="preserve">    【34】美国 | 社会保障购买力报告发布：2010年以来已下降20%</w:t>
         <w:br/>
-        <w:t xml:space="preserve">    【30】美国 | 4月社会保障支付分析：COLA 2.8%被Medicare保费上涨部分抵消</w:t>
+        <w:t xml:space="preserve">    【35】美国 | 4月社会保障支付分析：COLA 2.8%被Medicare保费上涨部分抵消</w:t>
         <w:br/>
-        <w:t xml:space="preserve">    【31】加拿大 | 4月28日CPP和OAS支付日确认，OAS季度微调0.1%</w:t>
+        <w:t xml:space="preserve">    【36】加拿大 | 4月28日CPP和OAS支付日确认，OAS季度微调0.1%</w:t>
         <w:br/>
-        <w:t>五、法规更新（共 3 条）</w:t>
+        <w:t>五、法规更新（共 4 条）</w:t>
         <w:br/>
-        <w:t xml:space="preserve">    【32】澳大利亚 | 超级年金缴费基数上限改为年度制，2026-27财年起实施</w:t>
+        <w:t xml:space="preserve">    【37】印度 | 政府公告：全印公务员（NPS实施）规则2026年正式公布</w:t>
         <w:br/>
-        <w:t xml:space="preserve">    【33】印度 | 私营部门NPS雇主缴款扣除比例提高至14%</w:t>
+        <w:t xml:space="preserve">    【38】澳大利亚 | 超级年金缴费基数上限改为年度制，2026-27财年起实施</w:t>
         <w:br/>
-        <w:t xml:space="preserve">    【34】印度 | 2026-27财年雇主养老金缴款统一上限设为75万卢比★</w:t>
+        <w:t xml:space="preserve">    【39】印度 | 私营部门NPS雇主缴款扣除比例提高至14%</w:t>
+        <w:br/>
+        <w:t xml:space="preserve">    【40】印度 | 2026-27财年雇主养老金缴款统一上限设为75万卢比★</w:t>
         <w:br/>
         <w:t>六、行政安排（共 2 条）</w:t>
         <w:br/>
-        <w:t xml:space="preserve">    【35】巴西 | INSS提前发放第13薪，4月24日起支付首批</w:t>
+        <w:t xml:space="preserve">    【41】巴西 | INSS提前发放第13薪，4月24日起支付首批</w:t>
         <w:br/>
-        <w:t xml:space="preserve">    【36】巴西 | INSS 2026年4月福利金支付日程公布</w:t>
+        <w:t xml:space="preserve">    【42】巴西 | INSS 2026年4月福利金支付日程公布</w:t>
       </w:r>
     </w:p>
     <w:p/>
@@ -234,7 +246,48 @@
           <w:b/>
           <w:sz w:val="28"/>
         </w:rPr>
-        <w:t>【3】德国 | 默茨提出法定养老金将降为"基础保障"：德国养老制度面临根本性改革★</w:t>
+        <w:t>【3】德国 | 内阁批准2027预算框架：削减40亿欧元联邦养老金补贴★</w:t>
+      </w:r>
+    </w:p>
+    <w:p>
+      <w:pPr>
+        <w:spacing w:line="420" w:lineRule="exact" w:before="0" w:after="0"/>
+        <w:ind w:firstLine="420"/>
+        <w:jc w:val="both"/>
+      </w:pPr>
+      <w:r>
+        <w:rPr>
+          <w:rFonts w:ascii="Times New Roman" w:hAnsi="Times New Roman" w:eastAsia="宋体"/>
+          <w:sz w:val="21"/>
+        </w:rPr>
+        <w:t>德国联邦内阁于2026年4月29日批准2027年预算框架，其中财政部长克林贝尔（Lars Klingbeil, SPD）提出自2027年起削减对法定养老保险的联邦补贴（Bundeszuschuss）40亿欧元，同时削减卫生基金（Gesundheitsfonds）20亿欧元。德国养老保险（DRV）警告此举将"不可避免地导致雇员和雇主缴费率上升"。专家预计缴费率将从18.6%升至18.8%，年收入3,500欧元的雇员每年多缴约42欧元。批评者指出此举与2025年养老金法案中"用税收收入维持缴费率稳定"的承诺相矛盾，缺乏战略一致性。最终预算法案预计2026年7月初提交议会审议。</w:t>
+      </w:r>
+    </w:p>
+    <w:p>
+      <w:pPr>
+        <w:spacing w:line="420" w:lineRule="exact" w:before="40" w:after="0"/>
+        <w:jc w:val="both"/>
+      </w:pPr>
+      <w:r>
+        <w:rPr>
+          <w:rFonts w:ascii="Times New Roman" w:hAnsi="Times New Roman" w:eastAsia="宋体"/>
+          <w:sz w:val="21"/>
+        </w:rPr>
+        <w:t>资料来源：Ruhr24 / Merkur / tz.de / Futurezone（多家德国媒体）（2026-04-29）</w:t>
+      </w:r>
+    </w:p>
+    <w:p>
+      <w:pPr>
+        <w:spacing w:line="560" w:lineRule="exact" w:before="120" w:after="0"/>
+        <w:jc w:val="left"/>
+      </w:pPr>
+      <w:r>
+        <w:rPr>
+          <w:rFonts w:ascii="Times New Roman" w:hAnsi="Times New Roman" w:eastAsia="宋体"/>
+          <w:b/>
+          <w:sz w:val="28"/>
+        </w:rPr>
+        <w:t>【4】德国 | 默茨提出法定养老金将降为"基础保障"：德国养老制度面临根本性改革★</w:t>
       </w:r>
     </w:p>
     <w:p>
@@ -275,7 +328,7 @@
           <w:b/>
           <w:sz w:val="28"/>
         </w:rPr>
-        <w:t>【4】墨西哥 | 辛鲍姆宣布进一步限制高额"金色养老金"，推进公共养老金公平化★</w:t>
+        <w:t>【5】墨西哥 | 辛鲍姆宣布进一步限制高额"金色养老金"，推进公共养老金公平化★</w:t>
       </w:r>
     </w:p>
     <w:p>
@@ -316,7 +369,48 @@
           <w:b/>
           <w:sz w:val="28"/>
         </w:rPr>
-        <w:t>【5】意大利 | 2026年意大利退休年龄因预期寿命调整再次上调</w:t>
+        <w:t>【6】意大利 | OECD经济调查敦促意大利削减第一支柱养老金成本</w:t>
+      </w:r>
+    </w:p>
+    <w:p>
+      <w:pPr>
+        <w:spacing w:line="420" w:lineRule="exact" w:before="0" w:after="0"/>
+        <w:ind w:firstLine="420"/>
+        <w:jc w:val="both"/>
+      </w:pPr>
+      <w:r>
+        <w:rPr>
+          <w:rFonts w:ascii="Times New Roman" w:hAnsi="Times New Roman" w:eastAsia="宋体"/>
+          <w:sz w:val="21"/>
+        </w:rPr>
+        <w:t>OECD于2026年4月23日发布意大利经济调查（Economic Survey of Italy），敦促意大利削减第一支柱养老金成本。意大利养老金支出占GDP约18%，远高于OECD平均12%。主要建议包括：在法律约束范围内探索中期削减第一支柱养老金成本的方案；考虑降低与缴款不匹配的高额养老金价值；维持退休年龄和应计率随预期寿命调整的现行规则；避免新的提前退休激励措施。OECD首席经济学家Stefano Scarpetta在罗马与意大利国库总干事Riccardo Barbieri共同发布报告。年龄相关成本预计在2030年代中期前持续上升，之后随制度转型逐步下降。</w:t>
+      </w:r>
+    </w:p>
+    <w:p>
+      <w:pPr>
+        <w:spacing w:line="420" w:lineRule="exact" w:before="40" w:after="0"/>
+        <w:jc w:val="both"/>
+      </w:pPr>
+      <w:r>
+        <w:rPr>
+          <w:rFonts w:ascii="Times New Roman" w:hAnsi="Times New Roman" w:eastAsia="宋体"/>
+          <w:sz w:val="21"/>
+        </w:rPr>
+        <w:t>资料来源：OECD / European Pensions / Eunews（2026-04-23）</w:t>
+      </w:r>
+    </w:p>
+    <w:p>
+      <w:pPr>
+        <w:spacing w:line="560" w:lineRule="exact" w:before="120" w:after="0"/>
+        <w:jc w:val="left"/>
+      </w:pPr>
+      <w:r>
+        <w:rPr>
+          <w:rFonts w:ascii="Times New Roman" w:hAnsi="Times New Roman" w:eastAsia="宋体"/>
+          <w:b/>
+          <w:sz w:val="28"/>
+        </w:rPr>
+        <w:t>【7】意大利 | 2026年意大利退休年龄因预期寿命调整再次上调</w:t>
       </w:r>
     </w:p>
     <w:p>
@@ -357,7 +451,7 @@
           <w:b/>
           <w:sz w:val="28"/>
         </w:rPr>
-        <w:t>【6】墨西哥 | 宪法第127条改革：高额公共养老金上限调至总统薪资50%★</w:t>
+        <w:t>【8】墨西哥 | 宪法第127条改革：高额公共养老金上限调至总统薪资50%★</w:t>
       </w:r>
     </w:p>
     <w:p>
@@ -398,7 +492,7 @@
           <w:b/>
           <w:sz w:val="28"/>
         </w:rPr>
-        <w:t>【7】意大利 | Quota 103提前退休选项2026年未获延期★</w:t>
+        <w:t>【9】意大利 | Quota 103提前退休选项2026年未获延期★</w:t>
       </w:r>
     </w:p>
     <w:p>
@@ -439,7 +533,7 @@
           <w:b/>
           <w:sz w:val="28"/>
         </w:rPr>
-        <w:t>【8】荷兰 | 参议院否决加快AOW国家养老金年龄上调提案★</w:t>
+        <w:t>【10】荷兰 | 参议院否决加快AOW国家养老金年龄上调提案★</w:t>
       </w:r>
     </w:p>
     <w:p>
@@ -480,7 +574,7 @@
           <w:b/>
           <w:sz w:val="28"/>
         </w:rPr>
-        <w:t>【9】法国 | 2023年养老金改革暂停：退休年龄不再向64岁推进★</w:t>
+        <w:t>【11】法国 | 2023年养老金改革暂停：退休年龄不再向64岁推进★</w:t>
       </w:r>
     </w:p>
     <w:p>
@@ -521,7 +615,7 @@
           <w:b/>
           <w:sz w:val="28"/>
         </w:rPr>
-        <w:t>【10】英国 | 国家养老金年龄开始从66岁逐步升至67岁★</w:t>
+        <w:t>【12】英国 | 国家养老金年龄开始从66岁逐步升至67岁★</w:t>
       </w:r>
     </w:p>
     <w:p>
@@ -549,6 +643,47 @@
           <w:sz w:val="21"/>
         </w:rPr>
         <w:t>资料来源：Parliament Today / PolicyMogul（2026-04-06）</w:t>
+      </w:r>
+    </w:p>
+    <w:p>
+      <w:pPr>
+        <w:spacing w:line="560" w:lineRule="exact" w:before="120" w:after="0"/>
+        <w:jc w:val="left"/>
+      </w:pPr>
+      <w:r>
+        <w:rPr>
+          <w:rFonts w:ascii="Times New Roman" w:hAnsi="Times New Roman" w:eastAsia="宋体"/>
+          <w:b/>
+          <w:sz w:val="28"/>
+        </w:rPr>
+        <w:t>【13】日本 | 撤销"年收入106万日元门槛"：短时间劳动者厚生年金大幅扩面★</w:t>
+      </w:r>
+    </w:p>
+    <w:p>
+      <w:pPr>
+        <w:spacing w:line="420" w:lineRule="exact" w:before="0" w:after="0"/>
+        <w:ind w:firstLine="420"/>
+        <w:jc w:val="both"/>
+      </w:pPr>
+      <w:r>
+        <w:rPr>
+          <w:rFonts w:ascii="Times New Roman" w:hAnsi="Times New Roman" w:eastAsia="宋体"/>
+          <w:sz w:val="21"/>
+        </w:rPr>
+        <w:t>日本2025年成立的《养老金制度改革法》进入实施阶段，2026年4月起启动过渡措施，10月起正式撤销短时间劳动者加入厚生年薪的月收入8.8万日元（年收106万日元）门槛。届时每周工作20小时以上者无论收入高低均须加入厚生年金，约180万人新纳入覆盖。2026年4月起，月薪12.6万日元以下的新加入者在50人以下企业可享受最长3年保险费50%减免优惠，企业可代为缴纳员工负担部分。4月起被扶养人认定规则同步变更，临时加班等导致的收入波动不会立即导致扶养资格丧失。"130万日元门槛"的认定规则也于4月起放宽。企业规模要件将于2027年起阶段性缩小，2035年完全废除。</w:t>
+      </w:r>
+    </w:p>
+    <w:p>
+      <w:pPr>
+        <w:spacing w:line="420" w:lineRule="exact" w:before="40" w:after="0"/>
+        <w:jc w:val="both"/>
+      </w:pPr>
+      <w:r>
+        <w:rPr>
+          <w:rFonts w:ascii="Times New Roman" w:hAnsi="Times New Roman" w:eastAsia="宋体"/>
+          <w:sz w:val="21"/>
+        </w:rPr>
+        <w:t>资料来源：厚生劳动省 / 日本年金机构 / LIMO（2026-04-01）</w:t>
       </w:r>
     </w:p>
     <w:p>
@@ -576,7 +711,7 @@
           <w:b/>
           <w:sz w:val="28"/>
         </w:rPr>
-        <w:t>【11】阿根廷 | ANSES 5月养老金上调3.38%，最低养老金增至393,174比索★</w:t>
+        <w:t>【14】阿根廷 | ANSES 5月养老金上调3.38%，最低养老金增至393,174比索★</w:t>
       </w:r>
     </w:p>
     <w:p>
@@ -617,7 +752,7 @@
           <w:b/>
           <w:sz w:val="28"/>
         </w:rPr>
-        <w:t>【12】意大利 | INPS 5月养老金自动重估值1.4%，Q1新增21.15万笔养老金</w:t>
+        <w:t>【15】意大利 | INPS 5月养老金自动重估值1.4%，Q1新增21.15万笔养老金</w:t>
       </w:r>
     </w:p>
     <w:p>
@@ -658,7 +793,7 @@
           <w:b/>
           <w:sz w:val="28"/>
         </w:rPr>
-        <w:t>【13】澳大利亚 | 超级年金2026-27财年缴费上限指数化调整：税前缴费上限提高至32,500澳元</w:t>
+        <w:t>【16】澳大利亚 | 超级年金2026-27财年缴费上限指数化调整：税前缴费上限提高至32,500澳元</w:t>
       </w:r>
     </w:p>
     <w:p>
@@ -699,7 +834,48 @@
           <w:b/>
           <w:sz w:val="28"/>
         </w:rPr>
-        <w:t>【14】德国 | 法定健康保险附加费率2026年升至2.9%，部分抵消养老金涨幅</w:t>
+        <w:t>【17】加拿大 | 春季经济更新：CPP基础缴费率从9.9%降至9.5%，2027年生效★</w:t>
+      </w:r>
+    </w:p>
+    <w:p>
+      <w:pPr>
+        <w:spacing w:line="420" w:lineRule="exact" w:before="0" w:after="0"/>
+        <w:ind w:firstLine="420"/>
+        <w:jc w:val="both"/>
+      </w:pPr>
+      <w:r>
+        <w:rPr>
+          <w:rFonts w:ascii="Times New Roman" w:hAnsi="Times New Roman" w:eastAsia="宋体"/>
+          <w:sz w:val="21"/>
+        </w:rPr>
+        <w:t>加拿大财政部长François-Philippe Champagne于2026年4月28日发布春季经济更新，宣布自2027年1月1日起将CPP基础缴费率从9.9%下调至9.5%（40个基点）。年收入7万加元的雇员每年可少缴约133加元，雇主对应减少相同金额，全国合计每年为缴款人节省约30亿加元。各省财政部长一致同意该调整。财政部引用2025年12月CPP精算报告，显示维持基金75年偿付能力所需最低缴费率比法定低69个基点，此次下调40个基点仍保留审慎缓冲空间。CPP增强部分（CPP2）缴费率不变。</w:t>
+      </w:r>
+    </w:p>
+    <w:p>
+      <w:pPr>
+        <w:spacing w:line="420" w:lineRule="exact" w:before="40" w:after="0"/>
+        <w:jc w:val="both"/>
+      </w:pPr>
+      <w:r>
+        <w:rPr>
+          <w:rFonts w:ascii="Times New Roman" w:hAnsi="Times New Roman" w:eastAsia="宋体"/>
+          <w:sz w:val="21"/>
+        </w:rPr>
+        <w:t>资料来源：CBC News / Global News / RBC Wealth Management（2026-04-28）</w:t>
+      </w:r>
+    </w:p>
+    <w:p>
+      <w:pPr>
+        <w:spacing w:line="560" w:lineRule="exact" w:before="120" w:after="0"/>
+        <w:jc w:val="left"/>
+      </w:pPr>
+      <w:r>
+        <w:rPr>
+          <w:rFonts w:ascii="Times New Roman" w:hAnsi="Times New Roman" w:eastAsia="宋体"/>
+          <w:b/>
+          <w:sz w:val="28"/>
+        </w:rPr>
+        <w:t>【18】德国 | 法定健康保险附加费率2026年升至2.9%，部分抵消养老金涨幅</w:t>
       </w:r>
     </w:p>
     <w:p>
@@ -740,7 +916,7 @@
           <w:b/>
           <w:sz w:val="28"/>
         </w:rPr>
-        <w:t>【15】韩国 | 韩国将加密资产纳入基础养老金资格审查范围★</w:t>
+        <w:t>【19】韩国 | 韩国将加密资产纳入基础养老金资格审查范围★</w:t>
       </w:r>
     </w:p>
     <w:p>
@@ -781,7 +957,7 @@
           <w:b/>
           <w:sz w:val="28"/>
         </w:rPr>
-        <w:t>【16】中国 | 五部门联合印发领取个人养老金有关问题通知★</w:t>
+        <w:t>【20】中国 | 五部门联合印发领取个人养老金有关问题通知★</w:t>
       </w:r>
     </w:p>
     <w:p>
@@ -822,7 +998,7 @@
           <w:b/>
           <w:sz w:val="28"/>
         </w:rPr>
-        <w:t>【17】澳大利亚 | 超级年金保证费率维持12%，"按周付超级"改革7月生效★</w:t>
+        <w:t>【21】澳大利亚 | 超级年金保证费率维持12%，"按周付超级"改革7月生效★</w:t>
       </w:r>
     </w:p>
     <w:p>
@@ -863,7 +1039,7 @@
           <w:b/>
           <w:sz w:val="28"/>
         </w:rPr>
-        <w:t>【18】德国 | 法定养老金2026年7月1日起上调4.24%★</w:t>
+        <w:t>【22】德国 | 法定养老金2026年7月1日起上调4.24%★</w:t>
       </w:r>
     </w:p>
     <w:p>
@@ -904,7 +1080,7 @@
           <w:b/>
           <w:sz w:val="28"/>
         </w:rPr>
-        <w:t>【19】英国 | 国家养老金三重锁定2026年4月生效：上涨4.8%★</w:t>
+        <w:t>【23】英国 | 国家养老金三重锁定2026年4月生效：上涨4.8%★</w:t>
       </w:r>
     </w:p>
     <w:p>
@@ -945,7 +1121,7 @@
           <w:b/>
           <w:sz w:val="28"/>
         </w:rPr>
-        <w:t>【20】中国 | 2026年养老金实现"22连涨"，"提低控高"差异化调整★</w:t>
+        <w:t>【24】中国 | 2026年养老金实现"22连涨"，"提低控高"差异化调整★</w:t>
       </w:r>
     </w:p>
     <w:p>
@@ -986,7 +1162,7 @@
           <w:b/>
           <w:sz w:val="28"/>
         </w:rPr>
-        <w:t>【21】法国 | 2026年社会保障预算法案确定最低养老金标准调整</w:t>
+        <w:t>【25】法国 | 2026年社会保障预算法案确定最低养老金标准调整</w:t>
       </w:r>
     </w:p>
     <w:p>
@@ -1027,7 +1203,7 @@
           <w:b/>
           <w:sz w:val="28"/>
         </w:rPr>
-        <w:t>【22】日本 | 国民年金4年连涨：2026年度基础年金增至70,608日元/月</w:t>
+        <w:t>【26】日本 | 国民年金4年连涨：2026年度基础年金增至70,608日元/月</w:t>
       </w:r>
     </w:p>
     <w:p>
@@ -1068,7 +1244,7 @@
           <w:b/>
           <w:sz w:val="28"/>
         </w:rPr>
-        <w:t>【23】阿根廷 | ANSES 4月养老金按2.90%上调并发放70,000比索额外补贴★</w:t>
+        <w:t>【27】阿根廷 | ANSES 4月养老金按2.90%上调并发放70,000比索额外补贴★</w:t>
       </w:r>
     </w:p>
     <w:p>
@@ -1109,7 +1285,7 @@
           <w:b/>
           <w:sz w:val="28"/>
         </w:rPr>
-        <w:t>【24】俄罗斯 | 政府签署法令：社会养老金自4月1日起上调14.75%★</w:t>
+        <w:t>【28】俄罗斯 | 政府签署法令：社会养老金自4月1日起上调14.75%★</w:t>
       </w:r>
     </w:p>
     <w:p>
@@ -1137,6 +1313,47 @@
           <w:sz w:val="21"/>
         </w:rPr>
         <w:t>资料来源：俄罗斯政府内阁 / AK&amp;M（2026-04-01）</w:t>
+      </w:r>
+    </w:p>
+    <w:p>
+      <w:pPr>
+        <w:spacing w:line="560" w:lineRule="exact" w:before="120" w:after="0"/>
+        <w:jc w:val="left"/>
+      </w:pPr>
+      <w:r>
+        <w:rPr>
+          <w:rFonts w:ascii="Times New Roman" w:hAnsi="Times New Roman" w:eastAsia="宋体"/>
+          <w:b/>
+          <w:sz w:val="28"/>
+        </w:rPr>
+        <w:t>【29】中国 | 城乡居民基础养老金月最低标准提高至163元，4月起补发差额★</w:t>
+      </w:r>
+    </w:p>
+    <w:p>
+      <w:pPr>
+        <w:spacing w:line="420" w:lineRule="exact" w:before="0" w:after="0"/>
+        <w:ind w:firstLine="420"/>
+        <w:jc w:val="both"/>
+      </w:pPr>
+      <w:r>
+        <w:rPr>
+          <w:rFonts w:ascii="Times New Roman" w:hAnsi="Times New Roman" w:eastAsia="宋体"/>
+          <w:sz w:val="21"/>
+        </w:rPr>
+        <w:t>根据2026年政府工作报告部署，城乡居民基础养老金月最低标准从143元提高至163元（增加20元），自2026年1月1日起执行。4月起各地陆续发放补发1-3月差额共计60元（20元×3个月），与当月163元基础养老金一同到账。该政策覆盖全国约1.8亿城乡居民养老金领取者（其中农村老人占比超七成），是城乡居民养老保险制度建立以来的第八次上调。北京、上海等地在国家标准基础上进一步上调，上海基础养老金达1,555元/月，北京达998元/月。</w:t>
+      </w:r>
+    </w:p>
+    <w:p>
+      <w:pPr>
+        <w:spacing w:line="420" w:lineRule="exact" w:before="40" w:after="0"/>
+        <w:jc w:val="both"/>
+      </w:pPr>
+      <w:r>
+        <w:rPr>
+          <w:rFonts w:ascii="Times New Roman" w:hAnsi="Times New Roman" w:eastAsia="宋体"/>
+          <w:sz w:val="21"/>
+        </w:rPr>
+        <w:t>资料来源：中国政府网 / 人民网 / 各省市政府公告（2026-04-01）</w:t>
       </w:r>
     </w:p>
     <w:p>
@@ -1164,7 +1381,7 @@
           <w:b/>
           <w:sz w:val="28"/>
         </w:rPr>
-        <w:t>【25】日本 | GPIF管理资产达约293万亿日元，首次投资海外亚洲房地产★</w:t>
+        <w:t>【30】日本 | GPIF管理资产达约293万亿日元，首次投资海外亚洲房地产★</w:t>
       </w:r>
     </w:p>
     <w:p>
@@ -1205,7 +1422,7 @@
           <w:b/>
           <w:sz w:val="28"/>
         </w:rPr>
-        <w:t>【26】韩国 | NPS外汇对冲比例拟提高，首次计划发行外币债券★</w:t>
+        <w:t>【31】韩国 | NPS外汇对冲比例拟提高，首次计划发行外币债券★</w:t>
       </w:r>
     </w:p>
     <w:p>
@@ -1260,7 +1477,7 @@
           <w:b/>
           <w:sz w:val="28"/>
         </w:rPr>
-        <w:t>【27】韩国 | NPS近12万人月领超200万韩元养老金，较2018年激增</w:t>
+        <w:t>【32】韩国 | NPS近12万人月领超200万韩元养老金，较2018年激增</w:t>
       </w:r>
     </w:p>
     <w:p>
@@ -1301,7 +1518,7 @@
           <w:b/>
           <w:sz w:val="28"/>
         </w:rPr>
-        <w:t>【28】中国 | 人社部一季度发布会：基本养老保险参保10.73亿人，基金累计结余10.8万亿★</w:t>
+        <w:t>【33】中国 | 人社部一季度发布会：基本养老保险参保10.73亿人，基金累计结余10.8万亿★</w:t>
       </w:r>
     </w:p>
     <w:p>
@@ -1342,7 +1559,7 @@
           <w:b/>
           <w:sz w:val="28"/>
         </w:rPr>
-        <w:t>【29】美国 | 社会保障购买力报告发布：2010年以来已下降20%</w:t>
+        <w:t>【34】美国 | 社会保障购买力报告发布：2010年以来已下降20%</w:t>
       </w:r>
     </w:p>
     <w:p>
@@ -1383,7 +1600,7 @@
           <w:b/>
           <w:sz w:val="28"/>
         </w:rPr>
-        <w:t>【30】美国 | 4月社会保障支付分析：COLA 2.8%被Medicare保费上涨部分抵消</w:t>
+        <w:t>【35】美国 | 4月社会保障支付分析：COLA 2.8%被Medicare保费上涨部分抵消</w:t>
       </w:r>
     </w:p>
     <w:p>
@@ -1424,7 +1641,7 @@
           <w:b/>
           <w:sz w:val="28"/>
         </w:rPr>
-        <w:t>【31】加拿大 | 4月28日CPP和OAS支付日确认，OAS季度微调0.1%</w:t>
+        <w:t>【36】加拿大 | 4月28日CPP和OAS支付日确认，OAS季度微调0.1%</w:t>
       </w:r>
     </w:p>
     <w:p>
@@ -1479,7 +1696,48 @@
           <w:b/>
           <w:sz w:val="28"/>
         </w:rPr>
-        <w:t>【32】澳大利亚 | 超级年金缴费基数上限改为年度制，2026-27财年起实施</w:t>
+        <w:t>【37】印度 | 政府公告：全印公务员（NPS实施）规则2026年正式公布</w:t>
+      </w:r>
+    </w:p>
+    <w:p>
+      <w:pPr>
+        <w:spacing w:line="420" w:lineRule="exact" w:before="0" w:after="0"/>
+        <w:ind w:firstLine="420"/>
+        <w:jc w:val="both"/>
+      </w:pPr>
+      <w:r>
+        <w:rPr>
+          <w:rFonts w:ascii="Times New Roman" w:hAnsi="Times New Roman" w:eastAsia="宋体"/>
+          <w:sz w:val="21"/>
+        </w:rPr>
+        <w:t>印度人事、公共申诉与养老金部（DoPT）于2026年4月22日在官方公报发布第G.S.R. 307(E)号通知，制定《全印公务员（国家养老金体系实施）规则2026》。适用于2004年1月1日及之后入职的全印公务员（IAS、IPS、IFoS等）。规定雇员缴款为基本工资+物价津贴的10%，政府缴款14%。建立严格缴款时限：入职后立即注册NPS，首笔缴款须在固定期限内完成；因行政原因延迟须按PPF利率计息补偿。入职时须在AIS(DCRB)规则1958和NPS之间做出死亡/残疾福利选择。退休年龄60岁，自愿退休需满20年服务（提前3个月通知）。强制使用"Bhavishya"集中系统进行养老金处理及数字化生存证明。</w:t>
+      </w:r>
+    </w:p>
+    <w:p>
+      <w:pPr>
+        <w:spacing w:line="420" w:lineRule="exact" w:before="40" w:after="0"/>
+        <w:jc w:val="both"/>
+      </w:pPr>
+      <w:r>
+        <w:rPr>
+          <w:rFonts w:ascii="Times New Roman" w:hAnsi="Times New Roman" w:eastAsia="宋体"/>
+          <w:sz w:val="21"/>
+        </w:rPr>
+        <w:t>资料来源：印度官方公报 / The Tribune / StaffNews（2026-04-22）</w:t>
+      </w:r>
+    </w:p>
+    <w:p>
+      <w:pPr>
+        <w:spacing w:line="560" w:lineRule="exact" w:before="120" w:after="0"/>
+        <w:jc w:val="left"/>
+      </w:pPr>
+      <w:r>
+        <w:rPr>
+          <w:rFonts w:ascii="Times New Roman" w:hAnsi="Times New Roman" w:eastAsia="宋体"/>
+          <w:b/>
+          <w:sz w:val="28"/>
+        </w:rPr>
+        <w:t>【38】澳大利亚 | 超级年金缴费基数上限改为年度制，2026-27财年起实施</w:t>
       </w:r>
     </w:p>
     <w:p>
@@ -1520,7 +1778,7 @@
           <w:b/>
           <w:sz w:val="28"/>
         </w:rPr>
-        <w:t>【33】印度 | 私营部门NPS雇主缴款扣除比例提高至14%</w:t>
+        <w:t>【39】印度 | 私营部门NPS雇主缴款扣除比例提高至14%</w:t>
       </w:r>
     </w:p>
     <w:p>
@@ -1561,7 +1819,7 @@
           <w:b/>
           <w:sz w:val="28"/>
         </w:rPr>
-        <w:t>【34】印度 | 2026-27财年雇主养老金缴款统一上限设为75万卢比★</w:t>
+        <w:t>【40】印度 | 2026-27财年雇主养老金缴款统一上限设为75万卢比★</w:t>
       </w:r>
     </w:p>
     <w:p>
@@ -1616,7 +1874,7 @@
           <w:b/>
           <w:sz w:val="28"/>
         </w:rPr>
-        <w:t>【35】巴西 | INSS提前发放第13薪，4月24日起支付首批</w:t>
+        <w:t>【41】巴西 | INSS提前发放第13薪，4月24日起支付首批</w:t>
       </w:r>
     </w:p>
     <w:p>
@@ -1657,7 +1915,7 @@
           <w:b/>
           <w:sz w:val="28"/>
         </w:rPr>
-        <w:t>【36】巴西 | INSS 2026年4月福利金支付日程公布</w:t>
+        <w:t>【42】巴西 | INSS 2026年4月福利金支付日程公布</w:t>
       </w:r>
     </w:p>
     <w:p>

</xml_diff>